<commit_message>
Update agent metadata and project documentation script
Replit-Commit-Author: Agent
</commit_message>
<xml_diff>
--- a/StarGazer-Project-Document.docx
+++ b/StarGazer-Project-Document.docx
@@ -1064,24 +1064,174 @@
         <w:spacing w:after="120" w:before="300"/>
       </w:pPr>
       <w:r>
-        <w:t xml:space="preserve">Initial Build</w:t>
-      </w:r>
-    </w:p>
-    <w:p>
-      <w:pPr>
-        <w:pStyle w:val="ListParagraph"/>
-        <w:numPr>
-          <w:ilvl w:val="0"/>
-          <w:numId w:val="1"/>
-        </w:numPr>
-        <w:spacing w:after="40" w:before="40"/>
-      </w:pPr>
-      <w:r>
-        <w:rPr>
-          <w:sz w:val="22"/>
-          <w:szCs w:val="22"/>
-        </w:rPr>
-        <w:t xml:space="preserve">Build me a full-stack astronomy web app called StarGazer. I want it to show real-time sky conditions from my location — planets, moon, bright stars, deep sky objects, ISS passes, weather. Dark theme, professional look.</w:t>
+        <w:t xml:space="preserve">Initial Build — Core App</w:t>
+      </w:r>
+    </w:p>
+    <w:p>
+      <w:pPr>
+        <w:pStyle w:val="ListParagraph"/>
+        <w:numPr>
+          <w:ilvl w:val="0"/>
+          <w:numId w:val="1"/>
+        </w:numPr>
+        <w:spacing w:after="40" w:before="40"/>
+      </w:pPr>
+      <w:r>
+        <w:rPr>
+          <w:sz w:val="22"/>
+          <w:szCs w:val="22"/>
+        </w:rPr>
+        <w:t xml:space="preserve">Build me a full-stack astronomy web app called StarGazer. I want it to show real-time sky conditions from my location — planets, moon, bright stars, deep sky objects, ISS passes, weather. Dark theme, professional look, monospace font for the data.</w:t>
+      </w:r>
+    </w:p>
+    <w:p>
+      <w:pPr>
+        <w:pStyle w:val="ListParagraph"/>
+        <w:numPr>
+          <w:ilvl w:val="0"/>
+          <w:numId w:val="1"/>
+        </w:numPr>
+        <w:spacing w:after="40" w:before="40"/>
+      </w:pPr>
+      <w:r>
+        <w:rPr>
+          <w:sz w:val="22"/>
+          <w:szCs w:val="22"/>
+        </w:rPr>
+        <w:t xml:space="preserve">Make the app location-aware. Add a location picker that lets me either auto-detect via GPS or search by city name. Save the location so it persists when I come back.</w:t>
+      </w:r>
+    </w:p>
+    <w:p>
+      <w:pPr>
+        <w:pStyle w:val="ListParagraph"/>
+        <w:numPr>
+          <w:ilvl w:val="0"/>
+          <w:numId w:val="1"/>
+        </w:numPr>
+        <w:spacing w:after="40" w:before="40"/>
+      </w:pPr>
+      <w:r>
+        <w:rPr>
+          <w:sz w:val="22"/>
+          <w:szCs w:val="22"/>
+        </w:rPr>
+        <w:t xml:space="preserve">Add a Dashboard as the home page. Show a sky overview with current conditions, a highlight of what is visible tonight, and quick navigation cards to every section.</w:t>
+      </w:r>
+    </w:p>
+    <w:p>
+      <w:pPr>
+        <w:spacing w:after="80" w:before="80"/>
+      </w:pPr>
+    </w:p>
+    <w:p>
+      <w:pPr>
+        <w:pStyle w:val="Heading2"/>
+        <w:spacing w:after="120" w:before="300"/>
+      </w:pPr>
+      <w:r>
+        <w:t xml:space="preserve">Initial Build — Individual Tabs</w:t>
+      </w:r>
+    </w:p>
+    <w:p>
+      <w:pPr>
+        <w:pStyle w:val="ListParagraph"/>
+        <w:numPr>
+          <w:ilvl w:val="0"/>
+          <w:numId w:val="1"/>
+        </w:numPr>
+        <w:spacing w:after="40" w:before="40"/>
+      </w:pPr>
+      <w:r>
+        <w:rPr>
+          <w:sz w:val="22"/>
+          <w:szCs w:val="22"/>
+        </w:rPr>
+        <w:t xml:space="preserve">Add a Planets tab showing all eight planets with rise time, transit time, set time, current altitude, azimuth, magnitude, and angular diameter. Show which ones are above the horizon right now.</w:t>
+      </w:r>
+    </w:p>
+    <w:p>
+      <w:pPr>
+        <w:pStyle w:val="ListParagraph"/>
+        <w:numPr>
+          <w:ilvl w:val="0"/>
+          <w:numId w:val="1"/>
+        </w:numPr>
+        <w:spacing w:after="40" w:before="40"/>
+      </w:pPr>
+      <w:r>
+        <w:rPr>
+          <w:sz w:val="22"/>
+          <w:szCs w:val="22"/>
+        </w:rPr>
+        <w:t xml:space="preserve">Add a Moon tab. I want to see the current phase name, illumination percentage, distance from Earth, angular diameter, rise and set times, and the dates of the next new moon and full moon.</w:t>
+      </w:r>
+    </w:p>
+    <w:p>
+      <w:pPr>
+        <w:pStyle w:val="ListParagraph"/>
+        <w:numPr>
+          <w:ilvl w:val="0"/>
+          <w:numId w:val="1"/>
+        </w:numPr>
+        <w:spacing w:after="40" w:before="40"/>
+      </w:pPr>
+      <w:r>
+        <w:rPr>
+          <w:sz w:val="22"/>
+          <w:szCs w:val="22"/>
+        </w:rPr>
+        <w:t xml:space="preserve">Add a Stars tab showing the brightest stars. Include altitude, azimuth, magnitude, spectral type, distance in light years, and the constellation. Let me filter to only stars above the horizon.</w:t>
+      </w:r>
+    </w:p>
+    <w:p>
+      <w:pPr>
+        <w:pStyle w:val="ListParagraph"/>
+        <w:numPr>
+          <w:ilvl w:val="0"/>
+          <w:numId w:val="1"/>
+        </w:numPr>
+        <w:spacing w:after="40" w:before="40"/>
+      </w:pPr>
+      <w:r>
+        <w:rPr>
+          <w:sz w:val="22"/>
+          <w:szCs w:val="22"/>
+        </w:rPr>
+        <w:t xml:space="preserve">Add a Deep Sky Objects tab with Messier and NGC objects — galaxies, nebulae, star clusters. Show visibility rating, angular size, distance, and observing notes for each object.</w:t>
+      </w:r>
+    </w:p>
+    <w:p>
+      <w:pPr>
+        <w:pStyle w:val="ListParagraph"/>
+        <w:numPr>
+          <w:ilvl w:val="0"/>
+          <w:numId w:val="1"/>
+        </w:numPr>
+        <w:spacing w:after="40" w:before="40"/>
+      </w:pPr>
+      <w:r>
+        <w:rPr>
+          <w:sz w:val="22"/>
+          <w:szCs w:val="22"/>
+        </w:rPr>
+        <w:t xml:space="preserve">Add an ISS Tracker tab that shows the next visible passes of the International Space Station over my location. Include max elevation, direction, rise and set times, and pass duration.</w:t>
+      </w:r>
+    </w:p>
+    <w:p>
+      <w:pPr>
+        <w:pStyle w:val="ListParagraph"/>
+        <w:numPr>
+          <w:ilvl w:val="0"/>
+          <w:numId w:val="1"/>
+        </w:numPr>
+        <w:spacing w:after="40" w:before="40"/>
+      </w:pPr>
+      <w:r>
+        <w:rPr>
+          <w:sz w:val="22"/>
+          <w:szCs w:val="22"/>
+        </w:rPr>
+        <w:t xml:space="preserve">Add a Conditions tab showing the sky quality for tonight. I want cloud cover percentage, atmospheric seeing index, transparency, wind speed, humidity, and an overall verdict like Good / Moderate / Poor.</w:t>
       </w:r>
     </w:p>
     <w:p>

</xml_diff>